<commit_message>
Align portfolio outcomes and metrics
</commit_message>
<xml_diff>
--- a/assets/leonid_saidulin_product_resume_en.docx
+++ b/assets/leonid_saidulin_product_resume_en.docx
@@ -114,7 +114,7 @@
           <w:color w:val="111111"/>
           <w:sz w:val="19"/>
         </w:rPr>
-        <w:t>Product Lead taking B2B SaaS products from customer research through go-to-market and first revenue. Seeking an international SaaS, PropTech, or Voice AI role where I can apply this experience and grow with a global team.</w:t>
+        <w:t>I am a Product Lead with experience building B2B SaaS products from customer research to first sales. I lead My Dom Online and am looking for an international SaaS, PropTech, or Voice AI team.</w:t>
       </w:r>
     </w:p>
     <w:p>
@@ -128,7 +128,7 @@
           <w:color w:val="111111"/>
           <w:sz w:val="19"/>
         </w:rPr>
-        <w:t>I lead product development at My Dom Online, software that automates work for property-management and utility-company employees. Its primary differentiator is a voice dispatcher that receives service requests and meter readings without staff involvement. I also identify and launch new directions that increase account value, create upsell opportunities, and strengthen the sales proposition.</w:t>
+        <w:t>My Dom Online helps property managers and utility companies automate work with residents. Its main advantage is a voice dispatcher that receives service requests and meter readings without staff involvement. I also launch new product areas that help us sell more to existing customers and explain the product's value to new ones.</w:t>
       </w:r>
     </w:p>
     <w:p>
@@ -156,7 +156,7 @@
           <w:color w:val="111111"/>
           <w:sz w:val="19"/>
         </w:rPr>
-        <w:t>159 active B2B customers | RUB 2.85M MRR | about 2M customer accounts | about 50K users. Apartments connected to the resident app grew 44% between Oct 2025 and May 2026. These figures describe company scale and team outcomes; the bullets below show my contribution.</w:t>
+        <w:t>159 active B2B customers | RUB 2.85M MRR | about 2M utility accounts | about 50K users. The number of apartments connected to the resident app grew 44% between Oct 2025 and May 2026. These are company and team figures.</w:t>
       </w:r>
     </w:p>
     <w:p>
@@ -197,7 +197,7 @@
           <w:color w:val="111111"/>
           <w:sz w:val="19"/>
         </w:rPr>
-        <w:t xml:space="preserve"> qualitative interviews, quantitative CRM, SQL and product analysis, segmentation, ICP definition, hypothesis testing, and AI-assisted synthesis.</w:t>
+        <w:t xml:space="preserve"> qualitative interviews, analysis of CRM data, SQL extracts and product metrics, customer segmentation, choosing a target segment, hypothesis testing, and using AI to transcribe and group interviews.</w:t>
       </w:r>
     </w:p>
     <w:p>
@@ -224,7 +224,7 @@
           <w:color w:val="111111"/>
           <w:sz w:val="19"/>
         </w:rPr>
-        <w:t xml:space="preserve"> B2B SaaS, 0-to-1 launches, go-to-market, first sales, roadmaps, P&amp;L, MRR, ARPU, payback, churn, and business-model design.</w:t>
+        <w:t xml:space="preserve"> B2B SaaS, building products from scratch and taking them to market, first sales, roadmaps, P&amp;L, MRR, ARPU, payback, churn, and product business models.</w:t>
       </w:r>
     </w:p>
     <w:p>
@@ -251,7 +251,7 @@
           <w:color w:val="111111"/>
           <w:sz w:val="19"/>
         </w:rPr>
-        <w:t xml:space="preserve"> Bitrix24, AppMetrica, n8n, Codex, OpenAI/LLM, SpeechKit, and MCP; AI sales-call analysis and evidence-based product hypothesis management.</w:t>
+        <w:t xml:space="preserve"> Bitrix24, AppMetrica, n8n, Codex, OpenAI/LLM, SpeechKit, and MCP; AI-assisted sales-call analysis and a product hypothesis backlog linked to calls and interviews.</w:t>
       </w:r>
     </w:p>
     <w:p>
@@ -278,7 +278,7 @@
           <w:color w:val="111111"/>
           <w:sz w:val="19"/>
         </w:rPr>
-        <w:t xml:space="preserve"> cross-functional leadership, external vendors, SLA management, APIs, integration negotiations, expert content, and organic blog growth.</w:t>
+        <w:t xml:space="preserve"> work with sales, support, engineering, finance, and legal; external vendors, SLA management, APIs, integration negotiations, and an expert blog.</w:t>
       </w:r>
     </w:p>
     <w:p>
@@ -366,7 +366,7 @@
           <w:color w:val="111111"/>
           <w:sz w:val="19"/>
         </w:rPr>
-        <w:t>Focused the product on service-oriented property managers.</w:t>
+        <w:t>Chose service-focused property managers as the core customer segment.</w:t>
       </w:r>
       <w:r>
         <w:rPr>
@@ -375,7 +375,7 @@
           <w:color w:val="111111"/>
           <w:sz w:val="19"/>
         </w:rPr>
-        <w:t xml:space="preserve"> Conducted 22 interviews and tested about six hypotheses. Selected companies investing in resident service and automation, repackaged MDO around their workflows, and made the voice dispatcher the primary differentiator.</w:t>
+        <w:t xml:space="preserve"> Conducted 22 interviews and tested about six hypotheses. I found that these companies were willing to invest in resident service and automation. I changed the positioning and sales materials around their workflows and made the voice dispatcher the product's main advantage.</w:t>
       </w:r>
     </w:p>
     <w:p>
@@ -393,7 +393,7 @@
           <w:color w:val="111111"/>
           <w:sz w:val="19"/>
         </w:rPr>
-        <w:t>Validated the positioning with a paid-services marketplace.</w:t>
+        <w:t>Built a paid-services marketplace for service-focused property managers.</w:t>
       </w:r>
       <w:r>
         <w:rPr>
@@ -402,7 +402,7 @@
           <w:color w:val="111111"/>
           <w:sz w:val="19"/>
         </w:rPr>
-        <w:t xml:space="preserve"> Built a resident-app module for services from the property manager and its partners. Three organizations joined the pilot; I closed one upsell and stopped standalone monetization when the pilot did not validate demand.</w:t>
+        <w:t xml:space="preserve"> The module lets a property manager sell its own services and partner services in the resident app. Three organizations joined the pilot, and I closed one upsell. I stopped pursuing separate monetization after the pilot did not confirm enough demand.</w:t>
       </w:r>
     </w:p>
     <w:p>
@@ -420,7 +420,7 @@
           <w:color w:val="111111"/>
           <w:sz w:val="19"/>
         </w:rPr>
-        <w:t>Launched utility billing from zero.</w:t>
+        <w:t>Validated demand for the MAX integration and launched upsells.</w:t>
       </w:r>
       <w:r>
         <w:rPr>
@@ -429,7 +429,7 @@
           <w:color w:val="111111"/>
           <w:sz w:val="19"/>
         </w:rPr>
-        <w:t xml:space="preserve"> Ran about 17 interviews with customers, external experts, billing specialists, and accountants, plus a mystery purchase and competitor reverse engineering. Chose in-house development, wrote the specification, selected 66bit and a billing expert, and accepted each MVP stage.</w:t>
+        <w:t xml:space="preserve"> Offer testing showed willingness to pay across 80% of the customer base. The upsell model adds 6% to base ARR, while connecting community chats expands the addressable audience fourfold, from 30K to 120K users. The larger active user base increases the business valuation.</w:t>
       </w:r>
     </w:p>
     <w:p>
@@ -447,7 +447,7 @@
           <w:color w:val="111111"/>
           <w:sz w:val="19"/>
         </w:rPr>
-        <w:t>Built the utility-billing go-to-market motion.</w:t>
+        <w:t>Started the utility-billing product from scratch.</w:t>
       </w:r>
       <w:r>
         <w:rPr>
@@ -456,7 +456,34 @@
           <w:color w:val="111111"/>
           <w:sz w:val="19"/>
         </w:rPr>
-        <w:t xml:space="preserve"> Created the pilot, content, landing page, and proposals; helped hire and onboard a sales manager and lead every technical call. In two months, the team covered 176 companies: 73 substantive conversations, 19 technical calls, five contract-stage or won deals, and two sales totaling RUB 18K MRR.</w:t>
+        <w:t xml:space="preserve"> Ran about 17 interviews with customers, external experts, billing specialists, and accountants, carried out a mystery-shopping exercise, and reviewed competing products. I wrote the specification, hired 66bit as the development vendor, found a billing expert, and now review and accept each MVP milestone.</w:t>
+      </w:r>
+    </w:p>
+    <w:p>
+      <w:pPr>
+        <w:pStyle w:val="ResumeBullet"/>
+        <w:numPr>
+          <w:ilvl w:val="0"/>
+          <w:numId w:val="1"/>
+        </w:numPr>
+      </w:pPr>
+      <w:r>
+        <w:rPr>
+          <w:rFonts w:ascii="Calibri" w:hAnsi="Calibri" w:eastAsia="Calibri"/>
+          <w:b/>
+          <w:color w:val="111111"/>
+          <w:sz w:val="19"/>
+        </w:rPr>
+        <w:t>Organized the launch and sales process for utility billing.</w:t>
+      </w:r>
+      <w:r>
+        <w:rPr>
+          <w:rFonts w:ascii="Calibri" w:hAnsi="Calibri" w:eastAsia="Calibri"/>
+          <w:b w:val="0"/>
+          <w:color w:val="111111"/>
+          <w:sz w:val="19"/>
+        </w:rPr>
+        <w:t xml:space="preserve"> Prepared the pilot program and proposals, helped hire and train a sales manager, and personally lead technical calls. In two months, the team worked through 176 companies, held 73 customer conversations and 19 technical calls. Two companies launched pilots and validated demand; one paid RUB 180K for an annual contract.</w:t>
       </w:r>
     </w:p>
     <w:p>
@@ -507,7 +534,7 @@
           <w:color w:val="111111"/>
           <w:sz w:val="19"/>
         </w:rPr>
-        <w:t>Run an annual market study.</w:t>
+        <w:t>Rebuilt MDO’s strategy for 2026–2028.</w:t>
       </w:r>
       <w:r>
         <w:rPr>
@@ -516,7 +543,7 @@
           <w:color w:val="111111"/>
           <w:sz w:val="19"/>
         </w:rPr>
-        <w:t xml:space="preserve"> Compare active and churned customers, non-buyers, prospects, service-oriented property managers, and competitor employees. Using eight interviews in 2026, I identified the risk of resident communication moving to GIS ЖКХ and selected an “AI dispatcher + human” model.</w:t>
+        <w:t xml:space="preserve"> Reconciled plan versus actual revenue, sales, churn, and P&amp;L with findings from 22 interviews. Prioritized SLA and retention, GIS ЖКХ, utility billing, and Voice AI. After the MVP test, I replaced the early billing-revenue forecast with KPIs for pilot quality and paid conversion.</w:t>
       </w:r>
     </w:p>
     <w:p>
@@ -534,7 +561,7 @@
           <w:color w:val="111111"/>
           <w:sz w:val="19"/>
         </w:rPr>
-        <w:t>Reconstruct real customer workflows.</w:t>
+        <w:t>I research the market every year.</w:t>
       </w:r>
       <w:r>
         <w:rPr>
@@ -543,7 +570,34 @@
           <w:color w:val="111111"/>
           <w:sz w:val="19"/>
         </w:rPr>
-        <w:t xml:space="preserve"> Define hidden hypotheses, ask respondents to replay their latest case, and compare answers with CRM, support, SQL, product behavior, and willingness to pay. AI transcribes and clusters the material; I store conclusions with links to the original evidence.</w:t>
+        <w:t xml:space="preserve"> I speak with active and former customers, companies that declined to buy, prospects, service-focused property managers, and competitor employees. After 22 interviews in 2026, I saw a risk: property managers and residents are gradually moving communication to GIS ЖКХ. I decided to develop the voice product as an “AI dispatcher + human” service.</w:t>
+      </w:r>
+    </w:p>
+    <w:p>
+      <w:pPr>
+        <w:pStyle w:val="ResumeBullet"/>
+        <w:numPr>
+          <w:ilvl w:val="0"/>
+          <w:numId w:val="1"/>
+        </w:numPr>
+      </w:pPr>
+      <w:r>
+        <w:rPr>
+          <w:rFonts w:ascii="Calibri" w:hAnsi="Calibri" w:eastAsia="Calibri"/>
+          <w:b/>
+          <w:color w:val="111111"/>
+          <w:sz w:val="19"/>
+        </w:rPr>
+        <w:t>During interviews, I ask people to walk me through a real case.</w:t>
+      </w:r>
+      <w:r>
+        <w:rPr>
+          <w:rFonts w:ascii="Calibri" w:hAnsi="Calibri" w:eastAsia="Calibri"/>
+          <w:b w:val="0"/>
+          <w:color w:val="111111"/>
+          <w:sz w:val="19"/>
+        </w:rPr>
+        <w:t xml:space="preserve"> I write hypotheses in advance but do not reveal them to the respondent. I then compare the answers with CRM data, support requests, SQL extracts, product usage, and willingness to pay. I use AI for transcription and initial grouping, then replay the important fragments myself.</w:t>
       </w:r>
     </w:p>
     <w:p>
@@ -575,7 +629,7 @@
           <w:color w:val="111111"/>
           <w:sz w:val="19"/>
         </w:rPr>
-        <w:t>Coordinate five functions and a two-person external engineering team:</w:t>
+        <w:t>I manage the product and coordinate work across sales, support, engineering, finance, and legal.</w:t>
       </w:r>
       <w:r>
         <w:rPr>
@@ -584,7 +638,7 @@
           <w:color w:val="111111"/>
           <w:sz w:val="19"/>
         </w:rPr>
-        <w:t xml:space="preserve"> sales, support and integrations, engineering, finance, and legal. Weekly reviews with the CEO remove customer and delivery blockers; monthly reviews cover revenue, payback, SLA, availability, churn, and usage; quarterly reviews cover P&amp;L, strategy, and stop/go decisions.</w:t>
+        <w:t xml:space="preserve"> The current external engineering team has two people. In weekly meetings with the CEO, we resolve issues slowing sales, implementation, and delivery. Each month I review revenue, payback, SLAs, service availability, churn, and product usage. Each quarter I review P&amp;L, strategy, and the list of active initiatives.</w:t>
       </w:r>
     </w:p>
     <w:p>
@@ -602,7 +656,7 @@
           <w:color w:val="111111"/>
           <w:sz w:val="19"/>
         </w:rPr>
-        <w:t>Improved engineering efficiency.</w:t>
+        <w:t>Reduced the engineering team from five people to two without lowering productivity.</w:t>
       </w:r>
       <w:r>
         <w:rPr>
@@ -611,7 +665,7 @@
           <w:color w:val="111111"/>
           <w:sz w:val="19"/>
         </w:rPr>
-        <w:t xml:space="preserve"> Found a specialist to audit the team and introduced AI tools into the delivery workflow. The backend/frontend team moved from five people to two and maintained release output.</w:t>
+        <w:t xml:space="preserve"> Brought in a specialist to audit the team and added AI tools to research, requirements, and engineering. The smaller team maintained the same output.</w:t>
       </w:r>
     </w:p>
     <w:p>
@@ -629,7 +683,7 @@
           <w:color w:val="111111"/>
           <w:sz w:val="19"/>
         </w:rPr>
-        <w:t>Introduced early churn-risk detection.</w:t>
+        <w:t>Set up early churn-risk alerts.</w:t>
       </w:r>
       <w:r>
         <w:rPr>
@@ -638,7 +692,7 @@
           <w:color w:val="111111"/>
           <w:sz w:val="19"/>
         </w:rPr>
-        <w:t xml:space="preserve"> I use SQL exports to flag a 20%+ decline in service requests, voice-bot usage, or dispatcher usage versus the previous three-month average, prompting the team to contact customers before cancellation.</w:t>
+        <w:t xml:space="preserve"> I use SQL extracts to find customers whose service requests, voice-bot usage, or dispatcher usage have fallen 20% or more against the previous three-month average. The team contacts them before cancellation and investigates the reasons with support and engineering.</w:t>
       </w:r>
     </w:p>
     <w:p>
@@ -679,7 +733,7 @@
           <w:color w:val="111111"/>
           <w:sz w:val="19"/>
         </w:rPr>
-        <w:t xml:space="preserve"> The Bitrix24 and AI workflow processed 1,501 unique calls and 290 client profiles and found 1,089 candidate signals; 265 were approved and published, including 57 manually approved.</w:t>
+        <w:t xml:space="preserve"> The service analyzes Bitrix24 calls every day. It processed 1,501 unique calls, built 290 customer profiles, and found 1,089 mentions of customer problems, requests, and ideas. After review, 265 observations entered the hypothesis backlog; I approved 57 of them manually.</w:t>
       </w:r>
     </w:p>
     <w:p>
@@ -697,7 +751,7 @@
           <w:color w:val="111111"/>
           <w:sz w:val="19"/>
         </w:rPr>
-        <w:t>Automated respondent and partner discovery.</w:t>
+        <w:t>Built an hh.ru search bot for respondents and sales partners.</w:t>
       </w:r>
       <w:r>
         <w:rPr>
@@ -706,7 +760,7 @@
           <w:color w:val="111111"/>
           <w:sz w:val="19"/>
         </w:rPr>
-        <w:t xml:space="preserve"> Built an hh.ru MCP and Telegram bot for interview recruitment; agency sales uses the same workflow to find partners.</w:t>
+        <w:t xml:space="preserve"> I use it to recruit interview participants, while the agency-sales team uses it to find partners.</w:t>
       </w:r>
     </w:p>
     <w:p>
@@ -724,7 +778,7 @@
           <w:color w:val="111111"/>
           <w:sz w:val="19"/>
         </w:rPr>
-        <w:t>Automated market monitoring.</w:t>
+        <w:t>Set up tender search and competitor monitoring.</w:t>
       </w:r>
       <w:r>
         <w:rPr>
@@ -733,7 +787,7 @@
           <w:color w:val="111111"/>
           <w:sz w:val="19"/>
         </w:rPr>
-        <w:t xml:space="preserve"> Built bots that collect relevant tenders and compare 15 competitor websites every day, tracking changes in products, pricing, and positioning.</w:t>
+        <w:t xml:space="preserve"> The bots collect relevant tenders and compare 15 competitor websites every day, tracking changes in products, pricing, and positioning.</w:t>
       </w:r>
     </w:p>
     <w:p>
@@ -751,7 +805,7 @@
           <w:color w:val="111111"/>
           <w:sz w:val="19"/>
         </w:rPr>
-        <w:t>Built an expert-content workflow.</w:t>
+        <w:t>Publish to the expert blog every two weeks.</w:t>
       </w:r>
       <w:r>
         <w:rPr>
@@ -760,7 +814,7 @@
           <w:color w:val="111111"/>
           <w:sz w:val="19"/>
         </w:rPr>
-        <w:t xml:space="preserve"> Every two weeks, I collect recurring industry topics, prepare drafts with AI, and verify facts and professional accuracy before publication and organic distribution.</w:t>
+        <w:t xml:space="preserve"> I collect current industry topics, prepare drafts with AI, and personally check the facts and professional accuracy before publication.</w:t>
       </w:r>
     </w:p>
     <w:p>
@@ -806,7 +860,7 @@
           <w:color w:val="111111"/>
           <w:sz w:val="19"/>
         </w:rPr>
-        <w:t>Built a local-services product for residential communities and took it from concept to MVP and pilots with developers and property managers. Closed it when the market did not validate willingness to pay for the added workflow.</w:t>
+        <w:t>Built a local-services product for residential communities and took it from concept to MVP and pilots with developers and property managers. Closed it when customers did not show enough willingness to pay for a separate service.</w:t>
       </w:r>
     </w:p>
     <w:p>

</xml_diff>

<commit_message>
Update bilingual product resumes
</commit_message>
<xml_diff>
--- a/assets/leonid_saidulin_product_resume_en.docx
+++ b/assets/leonid_saidulin_product_resume_en.docx
@@ -77,7 +77,7 @@
     </w:p>
     <w:p>
       <w:pPr>
-        <w:spacing w:before="0" w:after="100"/>
+        <w:spacing w:before="0" w:after="30"/>
         <w:ind w:right="1843"/>
       </w:pPr>
       <w:r>
@@ -88,6 +88,42 @@
         </w:rPr>
         <w:t>Yekaterinburg, Russia | remote / relocation | +7 (911) 836-39-71 | lsajdul@mail.ru | Telegram: @leonidsaidulin</w:t>
       </w:r>
+    </w:p>
+    <w:p>
+      <w:pPr>
+        <w:spacing w:before="0" w:after="80"/>
+        <w:ind w:right="1843"/>
+      </w:pPr>
+      <w:hyperlink r:id="rId10">
+        <w:r>
+          <w:rPr>
+            <w:rFonts w:ascii="Calibri" w:hAnsi="Calibri" w:eastAsia="Calibri"/>
+            <w:color w:val="2E74B5"/>
+            <w:u w:val="single"/>
+            <w:sz w:val="17"/>
+          </w:rPr>
+          <w:t>Portfolio</w:t>
+        </w:r>
+      </w:hyperlink>
+      <w:r>
+        <w:rPr>
+          <w:rFonts w:ascii="Calibri" w:hAnsi="Calibri" w:eastAsia="Calibri"/>
+          <w:color w:val="5B6573"/>
+          <w:sz w:val="17"/>
+        </w:rPr>
+        <w:t xml:space="preserve"> | </w:t>
+      </w:r>
+      <w:hyperlink r:id="rId11">
+        <w:r>
+          <w:rPr>
+            <w:rFonts w:ascii="Calibri" w:hAnsi="Calibri" w:eastAsia="Calibri"/>
+            <w:color w:val="2E74B5"/>
+            <w:u w:val="single"/>
+            <w:sz w:val="17"/>
+          </w:rPr>
+          <w:t>MDO Strategy 2026–2028</w:t>
+        </w:r>
+      </w:hyperlink>
     </w:p>
     <w:p>
       <w:pPr>
@@ -114,7 +150,7 @@
           <w:color w:val="111111"/>
           <w:sz w:val="19"/>
         </w:rPr>
-        <w:t>I am a Product Lead with experience building B2B SaaS products from customer research to first sales. I lead My Dom Online and am looking for an international SaaS, PropTech, or Voice AI team.</w:t>
+        <w:t>I lead B2B SaaS products from customer research to revenue. I map customer workflows, select the segment and value proposition, align decisions with the team, launch MVPs and pilots, and take validated hypotheses into sales.</w:t>
       </w:r>
     </w:p>
     <w:p>
@@ -128,7 +164,7 @@
           <w:color w:val="111111"/>
           <w:sz w:val="19"/>
         </w:rPr>
-        <w:t>My Dom Online helps property managers and utility companies automate work with residents. Its main advantage is a voice dispatcher that receives service requests and meter readings without staff involvement. I also launch new product areas that help us sell more to existing customers and explain the product's value to new ones.</w:t>
+        <w:t>At My Dom Online, I turned a complex, multi-level resident-service workflow into a clear value proposition for property-management professionals. I made the voice dispatcher the core product differentiator and launch adjacent products that create upsell opportunities. I am targeting international SaaS, PropTech, or Voice AI teams.</w:t>
       </w:r>
     </w:p>
     <w:p>
@@ -334,7 +370,7 @@
           <w:color w:val="111111"/>
           <w:sz w:val="19"/>
         </w:rPr>
-        <w:t>PropTech SaaS for property managers and utility suppliers: dispatcher CRM, voice dispatcher, resident and employee apps, web portal, MAX, GIS ЖКХ, and utility billing.</w:t>
+        <w:t>PropTech SaaS for property-management companies and utility suppliers: dispatcher CRM, voice dispatcher, resident and employee apps, web portal, MAX, Russia's national housing platform (GIS ЖКХ), and utility billing.</w:t>
       </w:r>
     </w:p>
     <w:p>
@@ -366,7 +402,7 @@
           <w:color w:val="111111"/>
           <w:sz w:val="19"/>
         </w:rPr>
-        <w:t>Chose service-focused property managers as the core customer segment.</w:t>
+        <w:t>Selected service-led property-management companies as the core segment during my first months.</w:t>
       </w:r>
       <w:r>
         <w:rPr>
@@ -375,7 +411,7 @@
           <w:color w:val="111111"/>
           <w:sz w:val="19"/>
         </w:rPr>
-        <w:t xml:space="preserve"> Conducted 22 interviews and tested about six hypotheses. I found that these companies were willing to invest in resident service and automation. I changed the positioning and sales materials around their workflows and made the voice dispatcher the product's main advantage.</w:t>
+        <w:t xml:space="preserve"> I ran 22 interviews and tested about six hypotheses. This segment showed the highest willingness to pay for automation. I turned a complex product into clear industry positioning and made the voice dispatcher its main advantage.</w:t>
       </w:r>
     </w:p>
     <w:p>
@@ -393,7 +429,7 @@
           <w:color w:val="111111"/>
           <w:sz w:val="19"/>
         </w:rPr>
-        <w:t>Built a paid-services marketplace for service-focused property managers.</w:t>
+        <w:t>Built a paid-services marketplace for service-led property-management companies.</w:t>
       </w:r>
       <w:r>
         <w:rPr>
@@ -402,7 +438,80 @@
           <w:color w:val="111111"/>
           <w:sz w:val="19"/>
         </w:rPr>
-        <w:t xml:space="preserve"> The module lets a property manager sell its own services and partner services in the resident app. Three organizations joined the pilot, and I closed one upsell. I stopped pursuing separate monetization after the pilot did not confirm enough demand.</w:t>
+        <w:t xml:space="preserve"> Three organizations joined the pilot, and I closed one upsell. The marketplace prompted a customer to move from about RUB 18K to RUB 45K MRR on a bundled plan, increasing monthly contract value about 2.5 times. The pilot did not validate standalone monetization.</w:t>
+      </w:r>
+    </w:p>
+    <w:p>
+      <w:pPr>
+        <w:pStyle w:val="ResumeBullet"/>
+        <w:numPr>
+          <w:ilvl w:val="0"/>
+          <w:numId w:val="1"/>
+        </w:numPr>
+      </w:pPr>
+      <w:r>
+        <w:rPr>
+          <w:rFonts w:ascii="Calibri" w:hAnsi="Calibri" w:eastAsia="Calibri"/>
+          <w:b/>
+          <w:color w:val="111111"/>
+          <w:sz w:val="19"/>
+        </w:rPr>
+        <w:t>Started an in-house utility-billing product to complete the resident-service proposition.</w:t>
+      </w:r>
+      <w:r>
+        <w:rPr>
+          <w:rFonts w:ascii="Calibri" w:hAnsi="Calibri" w:eastAsia="Calibri"/>
+          <w:b w:val="0"/>
+          <w:color w:val="111111"/>
+          <w:sz w:val="19"/>
+        </w:rPr>
+        <w:t xml:space="preserve"> Interviews confirmed that charges and billing should work with dispatch operations, resident records, and the mobile app. I ran about 17 interviews, completed a mystery-shopping exercise, reviewed competitors, wrote the specification, selected 66bit as the development partner, and now accept each MVP milestone.</w:t>
+      </w:r>
+    </w:p>
+    <w:p>
+      <w:pPr>
+        <w:pStyle w:val="ResumeBullet"/>
+        <w:numPr>
+          <w:ilvl w:val="0"/>
+          <w:numId w:val="1"/>
+        </w:numPr>
+      </w:pPr>
+      <w:r>
+        <w:rPr>
+          <w:rFonts w:ascii="Calibri" w:hAnsi="Calibri" w:eastAsia="Calibri"/>
+          <w:b/>
+          <w:color w:val="111111"/>
+          <w:sz w:val="19"/>
+        </w:rPr>
+        <w:t>Built the utility-billing launch and sales process.</w:t>
+      </w:r>
+      <w:r>
+        <w:rPr>
+          <w:rFonts w:ascii="Calibri" w:hAnsi="Calibri" w:eastAsia="Calibri"/>
+          <w:b w:val="0"/>
+          <w:color w:val="111111"/>
+          <w:sz w:val="19"/>
+        </w:rPr>
+        <w:t xml:space="preserve"> I prepared the pilot program, trained a sales manager, and led each technical call. In two months, the team covered 176 companies, held 73 customer conversations and 19 technical calls. Two companies launched pilots; one paid RUB 180K for an annual contract. At 10K accounts, billing software grows total MRR from RUB 55K to RUB 205K; managed billing grows it to RUB 455K.</w:t>
+      </w:r>
+    </w:p>
+    <w:p>
+      <w:r>
+        <w:br w:type="page"/>
+      </w:r>
+    </w:p>
+    <w:p>
+      <w:pPr>
+        <w:pStyle w:val="Heading2"/>
+      </w:pPr>
+      <w:r>
+        <w:rPr>
+          <w:rFonts w:ascii="Calibri" w:hAnsi="Calibri" w:eastAsia="Calibri"/>
+          <w:b w:val="0"/>
+          <w:color w:val="17365D"/>
+          <w:sz w:val="21"/>
+        </w:rPr>
+        <w:t>My Dom Online / SmartF LLC (continued)</w:t>
       </w:r>
     </w:p>
     <w:p>
@@ -429,80 +538,7 @@
           <w:color w:val="111111"/>
           <w:sz w:val="19"/>
         </w:rPr>
-        <w:t xml:space="preserve"> Offer testing showed willingness to pay across 80% of the customer base. The upsell model adds 6% to base ARR, while connecting community chats expands the addressable audience fourfold, from 30K to 120K users. The larger active user base increases the business valuation.</w:t>
-      </w:r>
-    </w:p>
-    <w:p>
-      <w:pPr>
-        <w:pStyle w:val="ResumeBullet"/>
-        <w:numPr>
-          <w:ilvl w:val="0"/>
-          <w:numId w:val="1"/>
-        </w:numPr>
-      </w:pPr>
-      <w:r>
-        <w:rPr>
-          <w:rFonts w:ascii="Calibri" w:hAnsi="Calibri" w:eastAsia="Calibri"/>
-          <w:b/>
-          <w:color w:val="111111"/>
-          <w:sz w:val="19"/>
-        </w:rPr>
-        <w:t>Started the utility-billing product from scratch.</w:t>
-      </w:r>
-      <w:r>
-        <w:rPr>
-          <w:rFonts w:ascii="Calibri" w:hAnsi="Calibri" w:eastAsia="Calibri"/>
-          <w:b w:val="0"/>
-          <w:color w:val="111111"/>
-          <w:sz w:val="19"/>
-        </w:rPr>
-        <w:t xml:space="preserve"> Ran about 17 interviews with customers, external experts, billing specialists, and accountants, carried out a mystery-shopping exercise, and reviewed competing products. I wrote the specification, hired 66bit as the development vendor, found a billing expert, and now review and accept each MVP milestone.</w:t>
-      </w:r>
-    </w:p>
-    <w:p>
-      <w:pPr>
-        <w:pStyle w:val="ResumeBullet"/>
-        <w:numPr>
-          <w:ilvl w:val="0"/>
-          <w:numId w:val="1"/>
-        </w:numPr>
-      </w:pPr>
-      <w:r>
-        <w:rPr>
-          <w:rFonts w:ascii="Calibri" w:hAnsi="Calibri" w:eastAsia="Calibri"/>
-          <w:b/>
-          <w:color w:val="111111"/>
-          <w:sz w:val="19"/>
-        </w:rPr>
-        <w:t>Organized the launch and sales process for utility billing.</w:t>
-      </w:r>
-      <w:r>
-        <w:rPr>
-          <w:rFonts w:ascii="Calibri" w:hAnsi="Calibri" w:eastAsia="Calibri"/>
-          <w:b w:val="0"/>
-          <w:color w:val="111111"/>
-          <w:sz w:val="19"/>
-        </w:rPr>
-        <w:t xml:space="preserve"> Prepared the pilot program and proposals, helped hire and train a sales manager, and personally lead technical calls. In two months, the team worked through 176 companies, held 73 customer conversations and 19 technical calls. Two companies launched pilots and validated demand; one paid RUB 180K for an annual contract.</w:t>
-      </w:r>
-    </w:p>
-    <w:p>
-      <w:r>
-        <w:br w:type="page"/>
-      </w:r>
-    </w:p>
-    <w:p>
-      <w:pPr>
-        <w:pStyle w:val="Heading2"/>
-      </w:pPr>
-      <w:r>
-        <w:rPr>
-          <w:rFonts w:ascii="Calibri" w:hAnsi="Calibri" w:eastAsia="Calibri"/>
-          <w:b w:val="0"/>
-          <w:color w:val="17365D"/>
-          <w:sz w:val="21"/>
-        </w:rPr>
-        <w:t>My Dom Online / SmartF LLC (continued)</w:t>
+        <w:t xml:space="preserve"> Offer testing showed willingness to pay across 80% of the customer base. The upsell model adds 6% to base ARR, while connecting resident group chats expands the addressable audience fourfold, from 30K to 120K users. The larger active user base increases the company's valuation potential.</w:t>
       </w:r>
     </w:p>
     <w:p>
@@ -534,7 +570,7 @@
           <w:color w:val="111111"/>
           <w:sz w:val="19"/>
         </w:rPr>
-        <w:t>Rebuilt MDO’s strategy for 2026–2028.</w:t>
+        <w:t>I prepare and present the product strategy to the company's owners each year.</w:t>
       </w:r>
       <w:r>
         <w:rPr>
@@ -543,7 +579,7 @@
           <w:color w:val="111111"/>
           <w:sz w:val="19"/>
         </w:rPr>
-        <w:t xml:space="preserve"> Reconciled plan versus actual revenue, sales, churn, and P&amp;L with findings from 22 interviews. Prioritized SLA and retention, GIS ЖКХ, utility billing, and Voice AI. After the MVP test, I replaced the early billing-revenue forecast with KPIs for pilot quality and paid conversion.</w:t>
+        <w:t xml:space="preserve"> For the 2026–2028 review, I compared 2025 and 2026 results, presented financial performance, product-development stages, the current business advantage, and plans with KPIs. I prioritized SLA and retention, GIS ЖКХ, utility billing, and Voice AI.</w:t>
       </w:r>
     </w:p>
     <w:p>
@@ -561,7 +597,7 @@
           <w:color w:val="111111"/>
           <w:sz w:val="19"/>
         </w:rPr>
-        <w:t>I research the market every year.</w:t>
+        <w:t>Ran a separate six-week market study in 2026.</w:t>
       </w:r>
       <w:r>
         <w:rPr>
@@ -570,7 +606,7 @@
           <w:color w:val="111111"/>
           <w:sz w:val="19"/>
         </w:rPr>
-        <w:t xml:space="preserve"> I speak with active and former customers, companies that declined to buy, prospects, service-focused property managers, and competitor employees. After 22 interviews in 2026, I saw a risk: property managers and residents are gradually moving communication to GIS ЖКХ. I decided to develop the voice product as an “AI dispatcher + human” service.</w:t>
+        <w:t xml:space="preserve"> I conducted 22 interviews with active and former customers, non-buyers, prospects, service-led property-management companies, and competitor employees. I identified the risk of resident requests moving to GIS ЖКХ and the opportunity for a contextual AI dispatcher that transfers complex cases to a person; both directions moved into development.</w:t>
       </w:r>
     </w:p>
     <w:p>

</xml_diff>